<commit_message>
feat: upgrade architecture, redesign frontend & fix template bugs
- Redesign README.md and add future_development_guide.md
- Add changelog for 2026-07-19
- Rename QoS模板.docx to QoS-template.docx
- Hide cable crossing mileage table prompt when no data is imported
- Add dynamic station telecom logic and optional location input with backward compatibility
</commit_message>
<xml_diff>
--- a/templates_docx/htzl_yxtx_sgt.docx
+++ b/templates_docx/htzl_yxtx_sgt.docx
@@ -1626,7 +1626,6 @@
         <w:spacing w:line="360" w:lineRule="auto"/>
         <w:ind w:firstLine="480"/>
         <w:rPr>
-          <w:rFonts w:hint="eastAsia"/>
           <w:bCs/>
           <w:sz w:val="24"/>
         </w:rPr>
@@ -1721,7 +1720,6 @@
         <w:spacing w:line="360" w:lineRule="auto"/>
         <w:ind w:firstLine="480"/>
         <w:rPr>
-          <w:rFonts w:hint="eastAsia"/>
           <w:bCs/>
           <w:sz w:val="24"/>
         </w:rPr>
@@ -1798,7 +1796,6 @@
         <w:spacing w:line="360" w:lineRule="auto"/>
         <w:ind w:firstLine="480"/>
         <w:rPr>
-          <w:rFonts w:hint="eastAsia"/>
           <w:bCs/>
           <w:sz w:val="24"/>
         </w:rPr>
@@ -1911,7 +1908,6 @@
         <w:spacing w:line="360" w:lineRule="auto"/>
         <w:ind w:firstLine="480"/>
         <w:rPr>
-          <w:rFonts w:hint="eastAsia"/>
           <w:bCs/>
           <w:sz w:val="24"/>
         </w:rPr>
@@ -1983,12 +1979,12 @@
       </w:r>
       <w:smartTag w:uri="urn:schemas-microsoft-com:office:smarttags" w:element="chmetcnv">
         <w:smartTagPr>
+          <w:attr w:name="UnitName" w:val="m"/>
+          <w:attr w:name="SourceValue" w:val="1"/>
+          <w:attr w:name="HasSpace" w:val="False"/>
+          <w:attr w:name="Negative" w:val="False"/>
+          <w:attr w:name="NumberType" w:val="1"/>
           <w:attr w:name="TCSC" w:val="0"/>
-          <w:attr w:name="NumberType" w:val="1"/>
-          <w:attr w:name="Negative" w:val="False"/>
-          <w:attr w:name="HasSpace" w:val="False"/>
-          <w:attr w:name="SourceValue" w:val="1"/>
-          <w:attr w:name="UnitName" w:val="m"/>
         </w:smartTagPr>
         <w:r>
           <w:rPr>
@@ -2060,12 +2056,12 @@
       </w:r>
       <w:smartTag w:uri="urn:schemas-microsoft-com:office:smarttags" w:element="chmetcnv">
         <w:smartTagPr>
+          <w:attr w:name="UnitName" w:val="mm"/>
+          <w:attr w:name="SourceValue" w:val="50"/>
+          <w:attr w:name="HasSpace" w:val="False"/>
+          <w:attr w:name="Negative" w:val="False"/>
+          <w:attr w:name="NumberType" w:val="1"/>
           <w:attr w:name="TCSC" w:val="0"/>
-          <w:attr w:name="NumberType" w:val="1"/>
-          <w:attr w:name="Negative" w:val="False"/>
-          <w:attr w:name="HasSpace" w:val="False"/>
-          <w:attr w:name="SourceValue" w:val="50"/>
-          <w:attr w:name="UnitName" w:val="mm"/>
         </w:smartTagPr>
         <w:r>
           <w:rPr>
@@ -2098,12 +2094,12 @@
       </w:r>
       <w:smartTag w:uri="urn:schemas-microsoft-com:office:smarttags" w:element="chmetcnv">
         <w:smartTagPr>
+          <w:attr w:name="UnitName" w:val="m"/>
+          <w:attr w:name="SourceValue" w:val="2"/>
+          <w:attr w:name="HasSpace" w:val="False"/>
+          <w:attr w:name="Negative" w:val="False"/>
+          <w:attr w:name="NumberType" w:val="1"/>
           <w:attr w:name="TCSC" w:val="0"/>
-          <w:attr w:name="NumberType" w:val="1"/>
-          <w:attr w:name="Negative" w:val="False"/>
-          <w:attr w:name="HasSpace" w:val="False"/>
-          <w:attr w:name="SourceValue" w:val="2"/>
-          <w:attr w:name="UnitName" w:val="m"/>
         </w:smartTagPr>
         <w:r>
           <w:rPr>
@@ -2284,12 +2280,12 @@
       </w:r>
       <w:smartTag w:uri="urn:schemas-microsoft-com:office:smarttags" w:element="chmetcnv">
         <w:smartTagPr>
+          <w:attr w:name="UnitName" w:val="m"/>
+          <w:attr w:name="SourceValue" w:val="1"/>
+          <w:attr w:name="HasSpace" w:val="False"/>
+          <w:attr w:name="Negative" w:val="False"/>
+          <w:attr w:name="NumberType" w:val="1"/>
           <w:attr w:name="TCSC" w:val="0"/>
-          <w:attr w:name="NumberType" w:val="1"/>
-          <w:attr w:name="Negative" w:val="False"/>
-          <w:attr w:name="HasSpace" w:val="False"/>
-          <w:attr w:name="SourceValue" w:val="1"/>
-          <w:attr w:name="UnitName" w:val="m"/>
         </w:smartTagPr>
         <w:r>
           <w:rPr>
@@ -2330,12 +2326,12 @@
       </w:r>
       <w:smartTag w:uri="urn:schemas-microsoft-com:office:smarttags" w:element="chmetcnv">
         <w:smartTagPr>
+          <w:attr w:name="UnitName" w:val="cm"/>
+          <w:attr w:name="SourceValue" w:val="1"/>
+          <w:attr w:name="HasSpace" w:val="False"/>
+          <w:attr w:name="Negative" w:val="False"/>
+          <w:attr w:name="NumberType" w:val="1"/>
           <w:attr w:name="TCSC" w:val="0"/>
-          <w:attr w:name="NumberType" w:val="1"/>
-          <w:attr w:name="Negative" w:val="False"/>
-          <w:attr w:name="HasSpace" w:val="False"/>
-          <w:attr w:name="SourceValue" w:val="1"/>
-          <w:attr w:name="UnitName" w:val="cm"/>
         </w:smartTagPr>
         <w:r>
           <w:rPr>
@@ -2370,12 +2366,12 @@
       </w:r>
       <w:smartTag w:uri="urn:schemas-microsoft-com:office:smarttags" w:element="chmetcnv">
         <w:smartTagPr>
+          <w:attr w:name="UnitName" w:val="mm"/>
+          <w:attr w:name="SourceValue" w:val="3"/>
+          <w:attr w:name="HasSpace" w:val="False"/>
+          <w:attr w:name="Negative" w:val="False"/>
+          <w:attr w:name="NumberType" w:val="1"/>
           <w:attr w:name="TCSC" w:val="0"/>
-          <w:attr w:name="NumberType" w:val="1"/>
-          <w:attr w:name="Negative" w:val="False"/>
-          <w:attr w:name="HasSpace" w:val="False"/>
-          <w:attr w:name="SourceValue" w:val="3"/>
-          <w:attr w:name="UnitName" w:val="mm"/>
         </w:smartTagPr>
         <w:r>
           <w:rPr>
@@ -2418,12 +2414,12 @@
       </w:r>
       <w:smartTag w:uri="urn:schemas-microsoft-com:office:smarttags" w:element="chmetcnv">
         <w:smartTagPr>
+          <w:attr w:name="UnitName" w:val="m"/>
+          <w:attr w:name="SourceValue" w:val="1.5"/>
+          <w:attr w:name="HasSpace" w:val="False"/>
+          <w:attr w:name="Negative" w:val="False"/>
+          <w:attr w:name="NumberType" w:val="1"/>
           <w:attr w:name="TCSC" w:val="0"/>
-          <w:attr w:name="NumberType" w:val="1"/>
-          <w:attr w:name="Negative" w:val="False"/>
-          <w:attr w:name="HasSpace" w:val="False"/>
-          <w:attr w:name="SourceValue" w:val="1.5"/>
-          <w:attr w:name="UnitName" w:val="m"/>
         </w:smartTagPr>
         <w:r>
           <w:rPr>
@@ -2442,12 +2438,12 @@
       </w:r>
       <w:smartTag w:uri="urn:schemas-microsoft-com:office:smarttags" w:element="chmetcnv">
         <w:smartTagPr>
+          <w:attr w:name="UnitName" w:val="mm"/>
+          <w:attr w:name="SourceValue" w:val="10"/>
+          <w:attr w:name="HasSpace" w:val="False"/>
+          <w:attr w:name="Negative" w:val="False"/>
+          <w:attr w:name="NumberType" w:val="1"/>
           <w:attr w:name="TCSC" w:val="0"/>
-          <w:attr w:name="NumberType" w:val="1"/>
-          <w:attr w:name="Negative" w:val="False"/>
-          <w:attr w:name="HasSpace" w:val="False"/>
-          <w:attr w:name="SourceValue" w:val="10"/>
-          <w:attr w:name="UnitName" w:val="mm"/>
         </w:smartTagPr>
         <w:r>
           <w:rPr>
@@ -3021,7 +3017,7 @@
         </w:rPr>
         <w:lastRenderedPageBreak/>
         <w:drawing>
-          <wp:inline distT="0" distB="0" distL="0" distR="0" wp14:anchorId="7CA5FF19" wp14:editId="4E22C940">
+          <wp:inline distT="0" distB="0" distL="0" distR="0" wp14:anchorId="00F4064D" wp14:editId="2CA259FE">
             <wp:extent cx="5600700" cy="3224530"/>
             <wp:effectExtent l="0" t="0" r="0" b="0"/>
             <wp:docPr id="1180078255" name="图片 4"/>
@@ -3100,7 +3096,7 @@
         </w:rPr>
         <w:lastRenderedPageBreak/>
         <w:drawing>
-          <wp:inline distT="0" distB="0" distL="0" distR="0" wp14:anchorId="073869EE" wp14:editId="01991A51">
+          <wp:inline distT="0" distB="0" distL="0" distR="0" wp14:anchorId="6B632A95" wp14:editId="56657C25">
             <wp:extent cx="5600700" cy="3331845"/>
             <wp:effectExtent l="0" t="0" r="0" b="1905"/>
             <wp:docPr id="881688075" name="图片 3"/>
@@ -4314,6 +4310,11 @@
       </w:r>
     </w:p>
     <w:p>
+      <w:r>
+        <w:t>{%p if has_cable_crossing_mileage %}</w:t>
+      </w:r>
+    </w:p>
+    <w:p>
       <w:pPr>
         <w:spacing w:line="360" w:lineRule="auto"/>
         <w:ind w:firstLine="480"/>
@@ -4328,6 +4329,11 @@
           <w:sz w:val="24"/>
         </w:rPr>
         <w:t>具体过轨里程见附表：有线通信过轨里程表。</w:t>
+      </w:r>
+    </w:p>
+    <w:p>
+      <w:r>
+        <w:t>{%p endif %}</w:t>
       </w:r>
     </w:p>
     <w:p>
@@ -4435,12 +4441,12 @@
       </w:r>
       <w:smartTag w:uri="urn:schemas-microsoft-com:office:smarttags" w:element="chmetcnv">
         <w:smartTagPr>
+          <w:attr w:name="TCSC" w:val="0"/>
+          <w:attr w:name="NumberType" w:val="1"/>
+          <w:attr w:name="Negative" w:val="False"/>
+          <w:attr w:name="HasSpace" w:val="False"/>
+          <w:attr w:name="SourceValue" w:val="250"/>
           <w:attr w:name="UnitName" w:val="mm"/>
-          <w:attr w:name="SourceValue" w:val="250"/>
-          <w:attr w:name="HasSpace" w:val="False"/>
-          <w:attr w:name="Negative" w:val="False"/>
-          <w:attr w:name="NumberType" w:val="1"/>
-          <w:attr w:name="TCSC" w:val="0"/>
         </w:smartTagPr>
         <w:r>
           <w:rPr>
@@ -4459,12 +4465,12 @@
       </w:r>
       <w:smartTag w:uri="urn:schemas-microsoft-com:office:smarttags" w:element="chmetcnv">
         <w:smartTagPr>
+          <w:attr w:name="TCSC" w:val="0"/>
+          <w:attr w:name="NumberType" w:val="1"/>
+          <w:attr w:name="Negative" w:val="False"/>
+          <w:attr w:name="HasSpace" w:val="False"/>
+          <w:attr w:name="SourceValue" w:val="150"/>
           <w:attr w:name="UnitName" w:val="mm"/>
-          <w:attr w:name="SourceValue" w:val="150"/>
-          <w:attr w:name="HasSpace" w:val="False"/>
-          <w:attr w:name="Negative" w:val="False"/>
-          <w:attr w:name="NumberType" w:val="1"/>
-          <w:attr w:name="TCSC" w:val="0"/>
         </w:smartTagPr>
         <w:r>
           <w:rPr>
@@ -4681,7 +4687,7 @@
           <w:sz w:val="24"/>
           <w:szCs w:val="28"/>
         </w:rPr>
-        <w:t>）当车站信号楼位于隧道横洞外侧时，横洞对应的隧道正洞内，两侧通信信号电缆槽间需预埋共</w:t>
+        <w:t>）当车站信号楼位于隧道横洞外侧时，横洞对应的隧道正洞内，两侧通信信号电缆槽</w:t>
       </w:r>
       <w:r>
         <w:rPr>
@@ -4689,6 +4695,15 @@
           <w:sz w:val="24"/>
           <w:szCs w:val="28"/>
         </w:rPr>
+        <w:lastRenderedPageBreak/>
+        <w:t>间需预埋共</w:t>
+      </w:r>
+      <w:r>
+        <w:rPr>
+          <w:rFonts w:hint="eastAsia"/>
+          <w:sz w:val="24"/>
+          <w:szCs w:val="28"/>
+        </w:rPr>
         <w:t>8</w:t>
       </w:r>
       <w:r>
@@ -4705,6 +4720,11 @@
           <w:sz w:val="24"/>
         </w:rPr>
         <w:t>采用“八字”埋设方式。</w:t>
+      </w:r>
+    </w:p>
+    <w:p>
+      <w:r>
+        <w:t>{%p if has_cable_crossing_mileage %}</w:t>
       </w:r>
     </w:p>
     <w:p>
@@ -4721,7 +4741,6 @@
           <w:rFonts w:hint="eastAsia"/>
           <w:sz w:val="24"/>
         </w:rPr>
-        <w:lastRenderedPageBreak/>
         <w:t>（</w:t>
       </w:r>
       <w:r>
@@ -4737,6 +4756,11 @@
           <w:sz w:val="24"/>
         </w:rPr>
         <w:t>）具体过轨里程见附表：有线通信过轨里程表。</w:t>
+      </w:r>
+    </w:p>
+    <w:p>
+      <w:r>
+        <w:t>{%p endif %}</w:t>
       </w:r>
     </w:p>
     <w:p>
@@ -4853,12 +4877,12 @@
       </w:r>
       <w:smartTag w:uri="urn:schemas-microsoft-com:office:smarttags" w:element="chmetcnv">
         <w:smartTagPr>
+          <w:attr w:name="TCSC" w:val="0"/>
+          <w:attr w:name="NumberType" w:val="1"/>
+          <w:attr w:name="Negative" w:val="False"/>
+          <w:attr w:name="HasSpace" w:val="False"/>
+          <w:attr w:name="SourceValue" w:val="5"/>
           <w:attr w:name="UnitName" w:val="km"/>
-          <w:attr w:name="SourceValue" w:val="5"/>
-          <w:attr w:name="HasSpace" w:val="False"/>
-          <w:attr w:name="Negative" w:val="False"/>
-          <w:attr w:name="NumberType" w:val="1"/>
-          <w:attr w:name="TCSC" w:val="0"/>
         </w:smartTagPr>
         <w:r>
           <w:rPr>
@@ -4877,12 +4901,12 @@
       </w:r>
       <w:smartTag w:uri="urn:schemas-microsoft-com:office:smarttags" w:element="chmetcnv">
         <w:smartTagPr>
+          <w:attr w:name="TCSC" w:val="0"/>
+          <w:attr w:name="NumberType" w:val="1"/>
+          <w:attr w:name="Negative" w:val="False"/>
+          <w:attr w:name="HasSpace" w:val="False"/>
+          <w:attr w:name="SourceValue" w:val="5"/>
           <w:attr w:name="UnitName" w:val="km"/>
-          <w:attr w:name="SourceValue" w:val="5"/>
-          <w:attr w:name="HasSpace" w:val="False"/>
-          <w:attr w:name="Negative" w:val="False"/>
-          <w:attr w:name="NumberType" w:val="1"/>
-          <w:attr w:name="TCSC" w:val="0"/>
         </w:smartTagPr>
         <w:r>
           <w:rPr>
@@ -5805,6 +5829,7 @@
           <w:rFonts w:hint="eastAsia"/>
           <w:sz w:val="24"/>
         </w:rPr>
+        <w:lastRenderedPageBreak/>
         <w:t>在桥梁疏散通道与桥梁结合部平台上预留视频监控系统摄像机视频</w:t>
       </w:r>
       <w:proofErr w:type="gramStart"/>
@@ -5884,9 +5909,8 @@
           <w:noProof/>
           <w:sz w:val="24"/>
         </w:rPr>
-        <w:lastRenderedPageBreak/>
         <w:drawing>
-          <wp:inline distT="0" distB="0" distL="0" distR="0" wp14:anchorId="68D8323E" wp14:editId="62218E71">
+          <wp:inline distT="0" distB="0" distL="0" distR="0" wp14:anchorId="0E5869CA" wp14:editId="70DF35C2">
             <wp:extent cx="3788410" cy="2097405"/>
             <wp:effectExtent l="0" t="0" r="2540" b="0"/>
             <wp:docPr id="1750883000" name="图片 4" descr="视频杆基础位置"/>
@@ -6263,7 +6287,7 @@
           <w:sz w:val="24"/>
         </w:rPr>
         <w:drawing>
-          <wp:inline distT="0" distB="0" distL="0" distR="0" wp14:anchorId="490C7241" wp14:editId="28E2F6E5">
+          <wp:inline distT="0" distB="0" distL="0" distR="0" wp14:anchorId="3E1E4957" wp14:editId="2AF05DCE">
             <wp:extent cx="2561590" cy="2583815"/>
             <wp:effectExtent l="0" t="0" r="0" b="6985"/>
             <wp:docPr id="1408232065" name="图片 3" descr="18B``17@$)0T$PB49}S@L[R"/>
@@ -6551,7 +6575,7 @@
         </w:rPr>
         <w:lastRenderedPageBreak/>
         <w:drawing>
-          <wp:inline distT="0" distB="0" distL="0" distR="0" wp14:anchorId="7D87F982" wp14:editId="51320011">
+          <wp:inline distT="0" distB="0" distL="0" distR="0" wp14:anchorId="624B8173" wp14:editId="05B1FBE9">
             <wp:extent cx="2924810" cy="3287395"/>
             <wp:effectExtent l="0" t="0" r="8890" b="8255"/>
             <wp:docPr id="756169446" name="图片 2" descr="K7SWP5RWQZTHVK$}T_TO({9"/>
@@ -8495,8 +8519,13 @@
     </w:p>
     <w:p>
       <w:pPr>
+        <w:pStyle w:val="ae"/>
+        <w:numPr>
+          <w:ilvl w:val="0"/>
+          <w:numId w:val="4"/>
+        </w:numPr>
         <w:spacing w:line="360" w:lineRule="auto"/>
-        <w:ind w:firstLineChars="200" w:firstLine="480"/>
+        <w:ind w:left="0" w:firstLineChars="0" w:firstLine="567"/>
         <w:rPr>
           <w:sz w:val="24"/>
           <w:szCs w:val="28"/>
@@ -8508,24 +8537,16 @@
           <w:sz w:val="24"/>
           <w:szCs w:val="28"/>
         </w:rPr>
-        <w:t>1</w:t>
-      </w:r>
-      <w:r>
-        <w:rPr>
-          <w:rFonts w:hint="eastAsia"/>
-          <w:sz w:val="24"/>
-          <w:szCs w:val="28"/>
-        </w:rPr>
-        <w:t>、在各站场内线路两侧均需站场专业预设通信信号专用电缆槽（含盖板），尺寸要求由信号专业汇总后提出。【参考尺寸：</w:t>
+        <w:t>在各站场内线路两侧均需站场专业预设通信信号专用电缆槽（含盖板），尺寸要求由信号专业汇总后提出。参考尺寸：</w:t>
       </w:r>
       <w:smartTag w:uri="urn:schemas-microsoft-com:office:smarttags" w:element="chmetcnv">
         <w:smartTagPr>
+          <w:attr w:name="UnitName" w:val="mm"/>
+          <w:attr w:name="SourceValue" w:val="450"/>
+          <w:attr w:name="HasSpace" w:val="False"/>
+          <w:attr w:name="Negative" w:val="False"/>
+          <w:attr w:name="NumberType" w:val="1"/>
           <w:attr w:name="TCSC" w:val="0"/>
-          <w:attr w:name="NumberType" w:val="1"/>
-          <w:attr w:name="Negative" w:val="False"/>
-          <w:attr w:name="HasSpace" w:val="False"/>
-          <w:attr w:name="SourceValue" w:val="450"/>
-          <w:attr w:name="UnitName" w:val="mm"/>
         </w:smartTagPr>
         <w:r>
           <w:rPr>
@@ -8546,12 +8567,12 @@
       </w:r>
       <w:smartTag w:uri="urn:schemas-microsoft-com:office:smarttags" w:element="chmetcnv">
         <w:smartTagPr>
+          <w:attr w:name="UnitName" w:val="mm"/>
+          <w:attr w:name="SourceValue" w:val="400"/>
+          <w:attr w:name="HasSpace" w:val="False"/>
+          <w:attr w:name="Negative" w:val="False"/>
+          <w:attr w:name="NumberType" w:val="1"/>
           <w:attr w:name="TCSC" w:val="0"/>
-          <w:attr w:name="NumberType" w:val="1"/>
-          <w:attr w:name="Negative" w:val="False"/>
-          <w:attr w:name="HasSpace" w:val="False"/>
-          <w:attr w:name="SourceValue" w:val="400"/>
-          <w:attr w:name="UnitName" w:val="mm"/>
         </w:smartTagPr>
         <w:r>
           <w:rPr>
@@ -8568,7 +8589,30 @@
           <w:sz w:val="24"/>
           <w:szCs w:val="28"/>
         </w:rPr>
-        <w:t>（净深）；普速铁路，与站场等站前专业协商确定，应确保至少信号楼侧有电缆槽；位于车站内的桥，应视其具体位置提出电缆槽侧向要求】。</w:t>
+        <w:t>（净深）。</w:t>
+      </w:r>
+    </w:p>
+    <w:p>
+      <w:r>
+        <w:t>{%p if has_station_txz %}</w:t>
+      </w:r>
+    </w:p>
+    <w:p>
+      <w:pPr>
+        <w:pStyle w:val="ae"/>
+        <w:numPr>
+          <w:ilvl w:val="0"/>
+          <w:numId w:val="4"/>
+        </w:numPr>
+        <w:spacing w:line="360" w:lineRule="auto"/>
+        <w:ind w:left="0" w:firstLineChars="0" w:firstLine="567"/>
+        <w:rPr>
+          <w:sz w:val="24"/>
+          <w:szCs w:val="28"/>
+        </w:rPr>
+      </w:pPr>
+      <w:r>
+        <w:t>{{ station_txz_loc }}站新建通信站，要求如下：</w:t>
       </w:r>
     </w:p>
     <w:p>
@@ -8584,9 +8628,30 @@
         <w:rPr>
           <w:rFonts w:hint="eastAsia"/>
           <w:sz w:val="24"/>
+        </w:rPr>
+        <w:t>（</w:t>
+      </w:r>
+      <w:r>
+        <w:rPr>
+          <w:rFonts w:hint="eastAsia"/>
+          <w:sz w:val="24"/>
+        </w:rPr>
+        <w:t>1</w:t>
+      </w:r>
+      <w:r>
+        <w:rPr>
+          <w:rFonts w:hint="eastAsia"/>
+          <w:sz w:val="24"/>
+        </w:rPr>
+        <w:t>）</w:t>
+      </w:r>
+      <w:r>
+        <w:rPr>
+          <w:rFonts w:hint="eastAsia"/>
+          <w:sz w:val="24"/>
           <w:szCs w:val="28"/>
         </w:rPr>
-        <w:t>2</w:t>
+        <w:t>场坪大小</w:t>
       </w:r>
       <w:r>
         <w:rPr>
@@ -8594,21 +8659,7 @@
           <w:sz w:val="24"/>
           <w:szCs w:val="28"/>
         </w:rPr>
-        <w:t>、</w:t>
-      </w:r>
-      <w:r>
-        <w:rPr>
-          <w:rFonts w:hint="eastAsia"/>
-          <w:sz w:val="24"/>
-        </w:rPr>
-        <w:t>XXX</w:t>
-      </w:r>
-      <w:r>
-        <w:rPr>
-          <w:rFonts w:hint="eastAsia"/>
-          <w:sz w:val="24"/>
-        </w:rPr>
-        <w:t>站新建通信站，</w:t>
+        <w:t>50m</w:t>
       </w:r>
       <w:r>
         <w:rPr>
@@ -8616,7 +8667,48 @@
           <w:sz w:val="24"/>
           <w:szCs w:val="28"/>
         </w:rPr>
-        <w:t>要求如下：</w:t>
+        <w:t>×</w:t>
+      </w:r>
+      <w:r>
+        <w:rPr>
+          <w:sz w:val="24"/>
+          <w:szCs w:val="28"/>
+        </w:rPr>
+        <w:t>60</w:t>
+      </w:r>
+      <w:r>
+        <w:rPr>
+          <w:rFonts w:hint="eastAsia"/>
+          <w:sz w:val="24"/>
+          <w:szCs w:val="28"/>
+        </w:rPr>
+        <w:t>m</w:t>
+      </w:r>
+      <w:r>
+        <w:rPr>
+          <w:rFonts w:hint="eastAsia"/>
+          <w:sz w:val="24"/>
+          <w:szCs w:val="28"/>
+        </w:rPr>
+        <w:t>，需考虑与外界公路连接。通信</w:t>
+      </w:r>
+      <w:proofErr w:type="gramStart"/>
+      <w:r>
+        <w:rPr>
+          <w:rFonts w:hint="eastAsia"/>
+          <w:sz w:val="24"/>
+          <w:szCs w:val="28"/>
+        </w:rPr>
+        <w:t>站综合</w:t>
+      </w:r>
+      <w:proofErr w:type="gramEnd"/>
+      <w:r>
+        <w:rPr>
+          <w:rFonts w:hint="eastAsia"/>
+          <w:sz w:val="24"/>
+          <w:szCs w:val="28"/>
+        </w:rPr>
+        <w:t>楼、门卫、车库以及材料库，集中建设于一个院子。具体房屋布置示意请见附图。</w:t>
       </w:r>
     </w:p>
     <w:p>
@@ -8640,7 +8732,7 @@
           <w:rFonts w:hint="eastAsia"/>
           <w:sz w:val="24"/>
         </w:rPr>
-        <w:t>1</w:t>
+        <w:t>2</w:t>
       </w:r>
       <w:r>
         <w:rPr>
@@ -8655,7 +8747,7 @@
           <w:sz w:val="24"/>
           <w:szCs w:val="28"/>
         </w:rPr>
-        <w:t>场坪大小</w:t>
+        <w:t>通信站要求避开受电磁以及强电干扰的地点至少</w:t>
       </w:r>
       <w:r>
         <w:rPr>
@@ -8663,7 +8755,7 @@
           <w:sz w:val="24"/>
           <w:szCs w:val="28"/>
         </w:rPr>
-        <w:t>50m</w:t>
+        <w:t>200</w:t>
       </w:r>
       <w:r>
         <w:rPr>
@@ -8671,48 +8763,7 @@
           <w:sz w:val="24"/>
           <w:szCs w:val="28"/>
         </w:rPr>
-        <w:t>×</w:t>
-      </w:r>
-      <w:r>
-        <w:rPr>
-          <w:sz w:val="24"/>
-          <w:szCs w:val="28"/>
-        </w:rPr>
-        <w:t>60</w:t>
-      </w:r>
-      <w:r>
-        <w:rPr>
-          <w:rFonts w:hint="eastAsia"/>
-          <w:sz w:val="24"/>
-          <w:szCs w:val="28"/>
-        </w:rPr>
-        <w:t>m</w:t>
-      </w:r>
-      <w:r>
-        <w:rPr>
-          <w:rFonts w:hint="eastAsia"/>
-          <w:sz w:val="24"/>
-          <w:szCs w:val="28"/>
-        </w:rPr>
-        <w:t>，需考虑与外界公路连接。通信</w:t>
-      </w:r>
-      <w:proofErr w:type="gramStart"/>
-      <w:r>
-        <w:rPr>
-          <w:rFonts w:hint="eastAsia"/>
-          <w:sz w:val="24"/>
-          <w:szCs w:val="28"/>
-        </w:rPr>
-        <w:t>站综合</w:t>
-      </w:r>
-      <w:proofErr w:type="gramEnd"/>
-      <w:r>
-        <w:rPr>
-          <w:rFonts w:hint="eastAsia"/>
-          <w:sz w:val="24"/>
-          <w:szCs w:val="28"/>
-        </w:rPr>
-        <w:t>楼、门卫、车库以及材料库，集中建设于一个院子。具体房屋布置示意请见附图。</w:t>
+        <w:t>米，如牵引变电所、接触网工区、开闭所、电力配电所等。</w:t>
       </w:r>
     </w:p>
     <w:p>
@@ -8728,156 +8779,9 @@
         <w:rPr>
           <w:rFonts w:hint="eastAsia"/>
           <w:sz w:val="24"/>
-        </w:rPr>
-        <w:t>（</w:t>
-      </w:r>
-      <w:r>
-        <w:rPr>
-          <w:rFonts w:hint="eastAsia"/>
-          <w:sz w:val="24"/>
-        </w:rPr>
-        <w:t>2</w:t>
-      </w:r>
-      <w:r>
-        <w:rPr>
-          <w:rFonts w:hint="eastAsia"/>
-          <w:sz w:val="24"/>
-        </w:rPr>
-        <w:t>）</w:t>
-      </w:r>
-      <w:r>
-        <w:rPr>
-          <w:rFonts w:hint="eastAsia"/>
-          <w:sz w:val="24"/>
           <w:szCs w:val="28"/>
         </w:rPr>
-        <w:t>通信站要求避开受电磁以及强电干扰的地点至少</w:t>
-      </w:r>
-      <w:r>
-        <w:rPr>
-          <w:rFonts w:hint="eastAsia"/>
-          <w:sz w:val="24"/>
-          <w:szCs w:val="28"/>
-        </w:rPr>
-        <w:t>200</w:t>
-      </w:r>
-      <w:r>
-        <w:rPr>
-          <w:rFonts w:hint="eastAsia"/>
-          <w:sz w:val="24"/>
-          <w:szCs w:val="28"/>
-        </w:rPr>
-        <w:t>米，如牵引变电所、接触网工区、开闭所、电力配电所等。【这一条的依据？】</w:t>
-      </w:r>
-    </w:p>
-    <w:p>
-      <w:pPr>
-        <w:spacing w:line="360" w:lineRule="auto"/>
-        <w:ind w:firstLineChars="200" w:firstLine="480"/>
-        <w:rPr>
-          <w:sz w:val="24"/>
-          <w:szCs w:val="28"/>
-        </w:rPr>
-      </w:pPr>
-      <w:bookmarkStart w:id="0" w:name="OLE_LINK1"/>
-      <w:r>
-        <w:rPr>
-          <w:rFonts w:hint="eastAsia"/>
-          <w:sz w:val="24"/>
-          <w:szCs w:val="28"/>
-        </w:rPr>
-        <w:t>铁运〔</w:t>
-      </w:r>
-      <w:r>
-        <w:rPr>
-          <w:rFonts w:hint="eastAsia"/>
-          <w:sz w:val="24"/>
-          <w:szCs w:val="28"/>
-        </w:rPr>
-        <w:t>2006</w:t>
-      </w:r>
-      <w:r>
-        <w:rPr>
-          <w:rFonts w:hint="eastAsia"/>
-          <w:sz w:val="24"/>
-          <w:szCs w:val="28"/>
-        </w:rPr>
-        <w:t>〕</w:t>
-      </w:r>
-      <w:r>
-        <w:rPr>
-          <w:rFonts w:hint="eastAsia"/>
-          <w:sz w:val="24"/>
-          <w:szCs w:val="28"/>
-        </w:rPr>
-        <w:t>26</w:t>
-      </w:r>
-      <w:r>
-        <w:rPr>
-          <w:rFonts w:hint="eastAsia"/>
-          <w:sz w:val="24"/>
-          <w:szCs w:val="28"/>
-        </w:rPr>
-        <w:t>号</w:t>
-      </w:r>
-      <w:bookmarkEnd w:id="0"/>
-      <w:r>
-        <w:rPr>
-          <w:rFonts w:hint="eastAsia"/>
-          <w:sz w:val="24"/>
-          <w:szCs w:val="28"/>
-        </w:rPr>
-        <w:t>关于印发《铁路信号设备雷电及电磁兼容综合防护实施指导意见》的通知规定了：</w:t>
-      </w:r>
-      <w:r>
-        <w:rPr>
-          <w:rFonts w:hint="eastAsia"/>
-          <w:sz w:val="24"/>
-          <w:szCs w:val="28"/>
-        </w:rPr>
-        <w:t xml:space="preserve">3.2.1 </w:t>
-      </w:r>
-      <w:r>
-        <w:rPr>
-          <w:rFonts w:hint="eastAsia"/>
-          <w:sz w:val="24"/>
-          <w:szCs w:val="28"/>
-        </w:rPr>
-        <w:t>机房在选址上除考虑生产需要、生活方便外，还应选在土壤电阻率低、腐蚀性小、距变（配）电所大于</w:t>
-      </w:r>
-      <w:r>
-        <w:rPr>
-          <w:rFonts w:hint="eastAsia"/>
-          <w:sz w:val="24"/>
-          <w:szCs w:val="28"/>
-        </w:rPr>
-        <w:t>200m</w:t>
-      </w:r>
-      <w:r>
-        <w:rPr>
-          <w:rFonts w:hint="eastAsia"/>
-          <w:sz w:val="24"/>
-          <w:szCs w:val="28"/>
-        </w:rPr>
-        <w:t>的位置。</w:t>
-      </w:r>
-    </w:p>
-    <w:p>
-      <w:pPr>
-        <w:spacing w:line="360" w:lineRule="auto"/>
-        <w:ind w:firstLineChars="200" w:firstLine="480"/>
-        <w:rPr>
-          <w:sz w:val="24"/>
-          <w:szCs w:val="28"/>
-        </w:rPr>
-      </w:pPr>
-      <w:r>
-        <w:rPr>
-          <w:rFonts w:hint="eastAsia"/>
-          <w:sz w:val="24"/>
-          <w:szCs w:val="28"/>
-        </w:rPr>
-        <w:t>改为：参考《电磁屏蔽室工程技术规范》（</w:t>
+        <w:t>参考《电磁屏蔽室工程技术规范》（</w:t>
       </w:r>
       <w:r>
         <w:rPr>
@@ -8971,7 +8875,6 @@
                 <w:sz w:val="24"/>
                 <w:szCs w:val="28"/>
               </w:rPr>
-              <w:lastRenderedPageBreak/>
               <w:t>电压（</w:t>
             </w:r>
             <w:r>
@@ -9418,69 +9321,19 @@
       </w:r>
     </w:p>
     <w:p>
-      <w:pPr>
-        <w:spacing w:line="360" w:lineRule="auto"/>
-        <w:ind w:firstLineChars="200" w:firstLine="480"/>
-        <w:rPr>
-          <w:sz w:val="24"/>
-          <w:szCs w:val="28"/>
-        </w:rPr>
-      </w:pPr>
-      <w:r>
-        <w:rPr>
-          <w:rFonts w:hint="eastAsia"/>
-          <w:sz w:val="24"/>
-          <w:szCs w:val="28"/>
-        </w:rPr>
-        <w:t>3</w:t>
-      </w:r>
-      <w:r>
-        <w:rPr>
-          <w:rFonts w:hint="eastAsia"/>
-          <w:sz w:val="24"/>
-          <w:szCs w:val="28"/>
-        </w:rPr>
-        <w:t>、在各车站咽喉处、站台外两端处均需预埋通信用</w:t>
-      </w:r>
-      <w:proofErr w:type="gramStart"/>
-      <w:r>
-        <w:rPr>
-          <w:rFonts w:hint="eastAsia"/>
-          <w:sz w:val="24"/>
-          <w:szCs w:val="28"/>
-        </w:rPr>
-        <w:t>过轨管</w:t>
-      </w:r>
-      <w:r>
-        <w:rPr>
-          <w:rFonts w:hint="eastAsia"/>
-          <w:sz w:val="24"/>
-          <w:szCs w:val="28"/>
-        </w:rPr>
-        <w:t>4</w:t>
-      </w:r>
-      <w:r>
-        <w:rPr>
-          <w:rFonts w:hint="eastAsia"/>
-          <w:sz w:val="24"/>
-          <w:szCs w:val="28"/>
-        </w:rPr>
-        <w:t>根</w:t>
-      </w:r>
-      <w:proofErr w:type="gramEnd"/>
-      <w:r>
-        <w:rPr>
-          <w:rFonts w:hint="eastAsia"/>
-          <w:sz w:val="24"/>
-          <w:szCs w:val="28"/>
-        </w:rPr>
-        <w:t>。</w:t>
+      <w:r>
+        <w:t>{%p endif %}</w:t>
       </w:r>
     </w:p>
     <w:p>
       <w:pPr>
+        <w:pStyle w:val="ae"/>
+        <w:numPr>
+          <w:ilvl w:val="0"/>
+          <w:numId w:val="4"/>
+        </w:numPr>
         <w:spacing w:line="360" w:lineRule="auto"/>
-        <w:ind w:firstLineChars="200" w:firstLine="480"/>
+        <w:ind w:left="0" w:firstLineChars="0" w:firstLine="567"/>
         <w:rPr>
           <w:sz w:val="24"/>
           <w:szCs w:val="28"/>
@@ -9492,6 +9345,23 @@
           <w:sz w:val="24"/>
           <w:szCs w:val="28"/>
         </w:rPr>
+        <w:t>在各车站咽喉处、站台外两端处均需预埋通信用</w:t>
+      </w:r>
+      <w:proofErr w:type="gramStart"/>
+      <w:r>
+        <w:rPr>
+          <w:rFonts w:hint="eastAsia"/>
+          <w:sz w:val="24"/>
+          <w:szCs w:val="28"/>
+        </w:rPr>
+        <w:t>过轨管</w:t>
+      </w:r>
+      <w:r>
+        <w:rPr>
+          <w:rFonts w:hint="eastAsia"/>
+          <w:sz w:val="24"/>
+          <w:szCs w:val="28"/>
+        </w:rPr>
         <w:t>4</w:t>
       </w:r>
       <w:r>
@@ -9500,31 +9370,27 @@
           <w:sz w:val="24"/>
           <w:szCs w:val="28"/>
         </w:rPr>
-        <w:t>、在各通信光电缆过轨处，</w:t>
-      </w:r>
-      <w:proofErr w:type="gramStart"/>
+        <w:t>根</w:t>
+      </w:r>
+      <w:proofErr w:type="gramEnd"/>
       <w:r>
         <w:rPr>
           <w:rFonts w:hint="eastAsia"/>
           <w:sz w:val="24"/>
           <w:szCs w:val="28"/>
         </w:rPr>
-        <w:t>过轨管两端</w:t>
-      </w:r>
-      <w:proofErr w:type="gramEnd"/>
-      <w:r>
-        <w:rPr>
-          <w:rFonts w:hint="eastAsia"/>
-          <w:sz w:val="24"/>
-          <w:szCs w:val="28"/>
-        </w:rPr>
-        <w:t>、线路两侧均需设通信手孔。</w:t>
+        <w:t>。</w:t>
       </w:r>
     </w:p>
     <w:p>
       <w:pPr>
+        <w:pStyle w:val="ae"/>
+        <w:numPr>
+          <w:ilvl w:val="0"/>
+          <w:numId w:val="4"/>
+        </w:numPr>
         <w:spacing w:line="360" w:lineRule="auto"/>
-        <w:ind w:firstLineChars="200" w:firstLine="480"/>
+        <w:ind w:left="0" w:firstLineChars="0" w:firstLine="567"/>
         <w:rPr>
           <w:sz w:val="24"/>
           <w:szCs w:val="28"/>
@@ -9536,15 +9402,49 @@
           <w:sz w:val="24"/>
           <w:szCs w:val="28"/>
         </w:rPr>
-        <w:t>5</w:t>
-      </w:r>
+        <w:lastRenderedPageBreak/>
+        <w:t>在各通信光电缆过轨处，</w:t>
+      </w:r>
+      <w:proofErr w:type="gramStart"/>
       <w:r>
         <w:rPr>
           <w:rFonts w:hint="eastAsia"/>
           <w:sz w:val="24"/>
           <w:szCs w:val="28"/>
         </w:rPr>
-        <w:t>、从站场通信</w:t>
+        <w:t>过轨管两端</w:t>
+      </w:r>
+      <w:proofErr w:type="gramEnd"/>
+      <w:r>
+        <w:rPr>
+          <w:rFonts w:hint="eastAsia"/>
+          <w:sz w:val="24"/>
+          <w:szCs w:val="28"/>
+        </w:rPr>
+        <w:t>、线路两侧均需设通信手孔。</w:t>
+      </w:r>
+    </w:p>
+    <w:p>
+      <w:pPr>
+        <w:pStyle w:val="ae"/>
+        <w:numPr>
+          <w:ilvl w:val="0"/>
+          <w:numId w:val="4"/>
+        </w:numPr>
+        <w:spacing w:line="360" w:lineRule="auto"/>
+        <w:ind w:left="0" w:firstLineChars="0" w:firstLine="567"/>
+        <w:rPr>
+          <w:sz w:val="24"/>
+          <w:szCs w:val="28"/>
+        </w:rPr>
+      </w:pPr>
+      <w:r>
+        <w:rPr>
+          <w:rFonts w:hint="eastAsia"/>
+          <w:sz w:val="24"/>
+          <w:szCs w:val="28"/>
+        </w:rPr>
+        <w:t>从站场通信</w:t>
       </w:r>
       <w:proofErr w:type="gramStart"/>
       <w:r>
@@ -9600,12 +9500,12 @@
       </w:r>
       <w:smartTag w:uri="urn:schemas-microsoft-com:office:smarttags" w:element="chmetcnv">
         <w:smartTagPr>
+          <w:attr w:name="UnitName" w:val="mm"/>
+          <w:attr w:name="SourceValue" w:val="250"/>
+          <w:attr w:name="HasSpace" w:val="False"/>
+          <w:attr w:name="Negative" w:val="False"/>
+          <w:attr w:name="NumberType" w:val="1"/>
           <w:attr w:name="TCSC" w:val="0"/>
-          <w:attr w:name="NumberType" w:val="1"/>
-          <w:attr w:name="Negative" w:val="False"/>
-          <w:attr w:name="HasSpace" w:val="False"/>
-          <w:attr w:name="SourceValue" w:val="250"/>
-          <w:attr w:name="UnitName" w:val="mm"/>
         </w:smartTagPr>
         <w:r>
           <w:rPr>
@@ -9636,12 +9536,12 @@
       <w:proofErr w:type="gramEnd"/>
       <w:smartTag w:uri="urn:schemas-microsoft-com:office:smarttags" w:element="chmetcnv">
         <w:smartTagPr>
+          <w:attr w:name="UnitName" w:val="mm"/>
+          <w:attr w:name="SourceValue" w:val="150"/>
+          <w:attr w:name="HasSpace" w:val="False"/>
+          <w:attr w:name="Negative" w:val="False"/>
+          <w:attr w:name="NumberType" w:val="1"/>
           <w:attr w:name="TCSC" w:val="0"/>
-          <w:attr w:name="NumberType" w:val="1"/>
-          <w:attr w:name="Negative" w:val="False"/>
-          <w:attr w:name="HasSpace" w:val="False"/>
-          <w:attr w:name="SourceValue" w:val="150"/>
-          <w:attr w:name="UnitName" w:val="mm"/>
         </w:smartTagPr>
         <w:r>
           <w:rPr>
@@ -9676,7 +9576,7 @@
           <w:sz w:val="24"/>
           <w:szCs w:val="28"/>
         </w:rPr>
-        <w:t>）。【普速铁路，与专业协商确定，至少保证信号楼、通信站、站房、大型房屋有分支电缆槽】。</w:t>
+        <w:t>）。</w:t>
       </w:r>
     </w:p>
     <w:p>
@@ -9685,7 +9585,7 @@
           <w:noProof/>
         </w:rPr>
         <w:drawing>
-          <wp:inline distT="0" distB="0" distL="0" distR="0" wp14:anchorId="1A448F14" wp14:editId="30AD41B3">
+          <wp:inline distT="0" distB="0" distL="0" distR="0" wp14:anchorId="1819D909" wp14:editId="32A7FB5F">
             <wp:extent cx="5600700" cy="5484495"/>
             <wp:effectExtent l="0" t="0" r="0" b="1905"/>
             <wp:docPr id="879209966" name="图片 2"/>
@@ -9769,7 +9669,6 @@
           <w:sz w:val="24"/>
           <w:szCs w:val="28"/>
         </w:rPr>
-        <w:lastRenderedPageBreak/>
         <w:t>房建</w:t>
       </w:r>
     </w:p>
@@ -12252,6 +12151,7 @@
           </w:tcPr>
           <w:p>
             <w:r>
+              <w:lastRenderedPageBreak/>
               <w:t>{%tr if has_xls %}</w:t>
             </w:r>
           </w:p>
@@ -13231,17 +13131,7 @@
                 <w:kern w:val="0"/>
                 <w:szCs w:val="21"/>
               </w:rPr>
-              <w:t>不含信号楼</w:t>
-            </w:r>
-            <w:r>
-              <w:rPr>
-                <w:rFonts w:ascii="宋体" w:hAnsi="宋体" w:cs="宋体" w:hint="eastAsia"/>
-                <w:color w:val="000000"/>
-                <w:kern w:val="0"/>
-                <w:szCs w:val="21"/>
-              </w:rPr>
-              <w:lastRenderedPageBreak/>
-              <w:t>的站房</w:t>
+              <w:t>不含信号楼的站房</w:t>
             </w:r>
           </w:p>
         </w:tc>
@@ -13259,7 +13149,6 @@
           </w:tcPr>
           <w:p>
             <w:r>
-              <w:lastRenderedPageBreak/>
               <w:t>{%tr endif %}</w:t>
             </w:r>
           </w:p>
@@ -15319,6 +15208,7 @@
           </w:tcPr>
           <w:p>
             <w:r>
+              <w:lastRenderedPageBreak/>
               <w:t>{%tr endif %}</w:t>
             </w:r>
           </w:p>
@@ -16439,7 +16329,17 @@
                 <w:kern w:val="0"/>
                 <w:szCs w:val="21"/>
               </w:rPr>
-              <w:t>采用箱式机房时，通信设备设于其主控室内</w:t>
+              <w:t>采用箱式机房</w:t>
+            </w:r>
+            <w:r>
+              <w:rPr>
+                <w:rFonts w:ascii="宋体" w:hAnsi="宋体" w:cs="宋体" w:hint="eastAsia"/>
+                <w:color w:val="000000"/>
+                <w:kern w:val="0"/>
+                <w:szCs w:val="21"/>
+              </w:rPr>
+              <w:lastRenderedPageBreak/>
+              <w:t>时，通信设备设于其主控室内</w:t>
             </w:r>
           </w:p>
         </w:tc>
@@ -16457,6 +16357,7 @@
           </w:tcPr>
           <w:p>
             <w:r>
+              <w:lastRenderedPageBreak/>
               <w:t>{%tr endif %}</w:t>
             </w:r>
           </w:p>
@@ -16745,17 +16646,7 @@
                 <w:kern w:val="0"/>
                 <w:szCs w:val="21"/>
               </w:rPr>
-              <w:t>设置有通信机械室</w:t>
-            </w:r>
-            <w:r>
-              <w:rPr>
-                <w:rFonts w:ascii="宋体" w:hAnsi="宋体" w:cs="宋体" w:hint="eastAsia"/>
-                <w:color w:val="000000"/>
-                <w:kern w:val="0"/>
-                <w:szCs w:val="21"/>
-              </w:rPr>
-              <w:lastRenderedPageBreak/>
-              <w:t>的地点</w:t>
+              <w:t>设置有通信机械室的地点</w:t>
             </w:r>
           </w:p>
         </w:tc>
@@ -16773,7 +16664,6 @@
           </w:tcPr>
           <w:p>
             <w:r>
-              <w:lastRenderedPageBreak/>
               <w:t>{%tr endif %}</w:t>
             </w:r>
           </w:p>
@@ -17682,12 +17572,12 @@
       </w:r>
       <w:smartTag w:uri="urn:schemas-microsoft-com:office:smarttags" w:element="chmetcnv">
         <w:smartTagPr>
+          <w:attr w:name="TCSC" w:val="0"/>
+          <w:attr w:name="NumberType" w:val="1"/>
+          <w:attr w:name="Negative" w:val="False"/>
+          <w:attr w:name="HasSpace" w:val="False"/>
+          <w:attr w:name="SourceValue" w:val="300"/>
           <w:attr w:name="UnitName" w:val="mm"/>
-          <w:attr w:name="SourceValue" w:val="300"/>
-          <w:attr w:name="HasSpace" w:val="False"/>
-          <w:attr w:name="Negative" w:val="False"/>
-          <w:attr w:name="NumberType" w:val="1"/>
-          <w:attr w:name="TCSC" w:val="0"/>
         </w:smartTagPr>
         <w:r>
           <w:rPr>
@@ -17799,7 +17689,6 @@
           <w:rFonts w:hint="eastAsia"/>
           <w:sz w:val="24"/>
         </w:rPr>
-        <w:lastRenderedPageBreak/>
         <w:t>（</w:t>
       </w:r>
       <w:r>
@@ -17931,7 +17820,7 @@
         <mc:AlternateContent>
           <mc:Choice Requires="wps">
             <w:drawing>
-              <wp:anchor distT="0" distB="0" distL="114300" distR="114300" simplePos="0" relativeHeight="251658752" behindDoc="0" locked="0" layoutInCell="1" allowOverlap="1" wp14:anchorId="1BDF2110" wp14:editId="5A042FEA">
+              <wp:anchor distT="0" distB="0" distL="114300" distR="114300" simplePos="0" relativeHeight="251658752" behindDoc="0" locked="0" layoutInCell="1" allowOverlap="1" wp14:anchorId="716341D4" wp14:editId="07E14573">
                 <wp:simplePos x="0" y="0"/>
                 <wp:positionH relativeFrom="column">
                   <wp:posOffset>157</wp:posOffset>
@@ -21576,7 +21465,7 @@
         <w:jc w:val="center"/>
       </w:pPr>
       <w:r>
-        <w:object w:dxaOrig="15000" w:dyaOrig="9675" w14:anchorId="6DAEFA53">
+        <w:object w:dxaOrig="15000" w:dyaOrig="9675" w14:anchorId="683201C0">
           <v:shapetype id="_x0000_t75" coordsize="21600,21600" o:spt="75" o:preferrelative="t" path="m@4@5l@4@11@9@11@9@5xe" filled="f" stroked="f">
             <v:stroke joinstyle="miter"/>
             <v:formulas>
@@ -21599,7 +21488,7 @@
           <v:shape id="_x0000_i1025" type="#_x0000_t75" style="width:422.4pt;height:190.8pt" o:ole="">
             <v:imagedata r:id="rId14" o:title="" croptop="26912f" cropbottom="13574f" cropleft="17065f" cropright="12918f"/>
           </v:shape>
-          <o:OLEObject Type="Embed" ProgID="AutoCAD.Drawing.18" ShapeID="_x0000_i1025" DrawAspect="Content" ObjectID="_1845925670" r:id="rId15"/>
+          <o:OLEObject Type="Embed" ProgID="AutoCAD.Drawing.18" ShapeID="_x0000_i1025" DrawAspect="Content" ObjectID="_1845963498" r:id="rId15"/>
         </w:object>
       </w:r>
       <w:r>
@@ -21613,7 +21502,7 @@
           <w:noProof/>
         </w:rPr>
         <w:drawing>
-          <wp:inline distT="0" distB="0" distL="0" distR="0" wp14:anchorId="6CC62594" wp14:editId="089CA078">
+          <wp:inline distT="0" distB="0" distL="0" distR="0" wp14:anchorId="617A0CB2" wp14:editId="224602B9">
             <wp:extent cx="4613275" cy="1652270"/>
             <wp:effectExtent l="0" t="0" r="0" b="5080"/>
             <wp:docPr id="1" name="图片 1"/>
@@ -30662,7 +30551,7 @@
         </w:rPr>
         <w:t>（2）</w:t>
       </w:r>
-      <w:bookmarkStart w:id="1" w:name="_Hlk206448240"/>
+      <w:bookmarkStart w:id="0" w:name="_Hlk206448240"/>
       <w:r>
         <w:rPr>
           <w:rFonts w:ascii="宋体" w:hAnsi="宋体" w:hint="eastAsia"/>
@@ -30705,7 +30594,7 @@
         </w:rPr>
         <w:t>。</w:t>
       </w:r>
-      <w:bookmarkEnd w:id="1"/>
+      <w:bookmarkEnd w:id="0"/>
     </w:p>
     <w:p>
       <w:pPr>
@@ -31047,12 +30936,12 @@
       </w:r>
       <w:smartTag w:uri="urn:schemas-microsoft-com:office:smarttags" w:element="chmetcnv">
         <w:smartTagPr>
+          <w:attr w:name="TCSC" w:val="0"/>
+          <w:attr w:name="NumberType" w:val="1"/>
+          <w:attr w:name="Negative" w:val="False"/>
+          <w:attr w:name="HasSpace" w:val="False"/>
+          <w:attr w:name="SourceValue" w:val="28"/>
           <w:attr w:name="UnitName" w:val="℃"/>
-          <w:attr w:name="SourceValue" w:val="28"/>
-          <w:attr w:name="HasSpace" w:val="False"/>
-          <w:attr w:name="Negative" w:val="False"/>
-          <w:attr w:name="NumberType" w:val="1"/>
-          <w:attr w:name="TCSC" w:val="0"/>
         </w:smartTagPr>
         <w:r>
           <w:rPr>
@@ -31078,12 +30967,12 @@
       </w:r>
       <w:smartTag w:uri="urn:schemas-microsoft-com:office:smarttags" w:element="chmetcnv">
         <w:smartTagPr>
+          <w:attr w:name="TCSC" w:val="0"/>
+          <w:attr w:name="NumberType" w:val="1"/>
+          <w:attr w:name="Negative" w:val="False"/>
+          <w:attr w:name="HasSpace" w:val="False"/>
+          <w:attr w:name="SourceValue" w:val="25"/>
           <w:attr w:name="UnitName" w:val="℃"/>
-          <w:attr w:name="SourceValue" w:val="25"/>
-          <w:attr w:name="HasSpace" w:val="False"/>
-          <w:attr w:name="Negative" w:val="False"/>
-          <w:attr w:name="NumberType" w:val="1"/>
-          <w:attr w:name="TCSC" w:val="0"/>
         </w:smartTagPr>
         <w:r>
           <w:rPr>
@@ -33107,7 +32996,7 @@
         </w:rPr>
         <w:lastRenderedPageBreak/>
         <w:drawing>
-          <wp:inline distT="0" distB="0" distL="0" distR="0" wp14:anchorId="7BC4DF40" wp14:editId="4AB59B47">
+          <wp:inline distT="0" distB="0" distL="0" distR="0" wp14:anchorId="72E348EC" wp14:editId="14717E26">
             <wp:extent cx="4772691" cy="6906589"/>
             <wp:effectExtent l="0" t="0" r="8890" b="8890"/>
             <wp:docPr id="2" name="图片 2"/>
@@ -35189,6 +35078,92 @@
       </w:pPr>
     </w:lvl>
   </w:abstractNum>
+  <w:abstractNum w:abstractNumId="3" w15:restartNumberingAfterBreak="0">
+    <w:nsid w:val="444C5A08"/>
+    <w:multiLevelType w:val="hybridMultilevel"/>
+    <w:tmpl w:val="41D623FC"/>
+    <w:lvl w:ilvl="0" w:tplc="0409000F">
+      <w:start w:val="1"/>
+      <w:numFmt w:val="decimal"/>
+      <w:lvlText w:val="%1."/>
+      <w:lvlJc w:val="left"/>
+      <w:pPr>
+        <w:ind w:left="920" w:hanging="440"/>
+      </w:pPr>
+    </w:lvl>
+    <w:lvl w:ilvl="1" w:tplc="04090019" w:tentative="1">
+      <w:start w:val="1"/>
+      <w:numFmt w:val="lowerLetter"/>
+      <w:lvlText w:val="%2)"/>
+      <w:lvlJc w:val="left"/>
+      <w:pPr>
+        <w:ind w:left="1360" w:hanging="440"/>
+      </w:pPr>
+    </w:lvl>
+    <w:lvl w:ilvl="2" w:tplc="0409001B" w:tentative="1">
+      <w:start w:val="1"/>
+      <w:numFmt w:val="lowerRoman"/>
+      <w:lvlText w:val="%3."/>
+      <w:lvlJc w:val="right"/>
+      <w:pPr>
+        <w:ind w:left="1800" w:hanging="440"/>
+      </w:pPr>
+    </w:lvl>
+    <w:lvl w:ilvl="3" w:tplc="0409000F" w:tentative="1">
+      <w:start w:val="1"/>
+      <w:numFmt w:val="decimal"/>
+      <w:lvlText w:val="%4."/>
+      <w:lvlJc w:val="left"/>
+      <w:pPr>
+        <w:ind w:left="2240" w:hanging="440"/>
+      </w:pPr>
+    </w:lvl>
+    <w:lvl w:ilvl="4" w:tplc="04090019" w:tentative="1">
+      <w:start w:val="1"/>
+      <w:numFmt w:val="lowerLetter"/>
+      <w:lvlText w:val="%5)"/>
+      <w:lvlJc w:val="left"/>
+      <w:pPr>
+        <w:ind w:left="2680" w:hanging="440"/>
+      </w:pPr>
+    </w:lvl>
+    <w:lvl w:ilvl="5" w:tplc="0409001B" w:tentative="1">
+      <w:start w:val="1"/>
+      <w:numFmt w:val="lowerRoman"/>
+      <w:lvlText w:val="%6."/>
+      <w:lvlJc w:val="right"/>
+      <w:pPr>
+        <w:ind w:left="3120" w:hanging="440"/>
+      </w:pPr>
+    </w:lvl>
+    <w:lvl w:ilvl="6" w:tplc="0409000F" w:tentative="1">
+      <w:start w:val="1"/>
+      <w:numFmt w:val="decimal"/>
+      <w:lvlText w:val="%7."/>
+      <w:lvlJc w:val="left"/>
+      <w:pPr>
+        <w:ind w:left="3560" w:hanging="440"/>
+      </w:pPr>
+    </w:lvl>
+    <w:lvl w:ilvl="7" w:tplc="04090019" w:tentative="1">
+      <w:start w:val="1"/>
+      <w:numFmt w:val="lowerLetter"/>
+      <w:lvlText w:val="%8)"/>
+      <w:lvlJc w:val="left"/>
+      <w:pPr>
+        <w:ind w:left="4000" w:hanging="440"/>
+      </w:pPr>
+    </w:lvl>
+    <w:lvl w:ilvl="8" w:tplc="0409001B" w:tentative="1">
+      <w:start w:val="1"/>
+      <w:numFmt w:val="lowerRoman"/>
+      <w:lvlText w:val="%9."/>
+      <w:lvlJc w:val="right"/>
+      <w:pPr>
+        <w:ind w:left="4440" w:hanging="440"/>
+      </w:pPr>
+    </w:lvl>
+  </w:abstractNum>
   <w:num w:numId="1" w16cid:durableId="43412955">
     <w:abstractNumId w:val="2"/>
   </w:num>
@@ -35197,6 +35172,9 @@
   </w:num>
   <w:num w:numId="3" w16cid:durableId="2039088590">
     <w:abstractNumId w:val="1"/>
+  </w:num>
+  <w:num w:numId="4" w16cid:durableId="641038068">
+    <w:abstractNumId w:val="3"/>
   </w:num>
 </w:numbering>
 </file>

</xml_diff>